<commit_message>
Toolkit: haipipe-draft and haipipe-block, Block delivery/ and related/
- haipipe-page is now haipipe-draft (its workflow Runs haipipe-draft-*),
  with a haipipe-page alias link; haipipe-board is now haipipe-block.
- Every level's build goes to its Block's one delivery/ (haipipe-delivery,
  src.common delivery_dir); outside material goes to the Block's related/
  (haipipe-related). A Task may hold a draft.
- Workbench: a Block, Job or Task opens on its Studio; Report questions
  inferred from the work; design, insight, cowork and paper views updated.
- Tests follow the moved delivery lane: design tests load the host paths
  for src.common, the design fixture releases into the Block's delivery/,
  draft tests read delivery_lane_dir and compare resolved paths.

Co-Authored-By: Claude Opus 5.5 <noreply@anthropic.com>
</commit_message>
<xml_diff>
--- a/plugins/haipipe-toolkit/skills/1_base/page/pages-example/haipipe-page-guide/delivery/word/haipipe-page-guide.docx
+++ b/plugins/haipipe-toolkit/skills/1_base/page/pages-example/haipipe-page-guide/delivery/word/haipipe-page-guide.docx
@@ -30,6 +30,22 @@
       </w:r>
     </w:p>
     <w:p>
+      <w:pPr>
+        <w:pStyle w:val="Code"/>
+      </w:pPr>
+      <w:r>
+        <w:t xml:space="preserve">Page Folder</w:t>
+        <w:br/>
+        <w:t xml:space="preserve">├── page.toml         source registration</w:t>
+        <w:br/>
+        <w:t xml:space="preserve">├── Page.md           Opening · Content · Aims</w:t>
+        <w:br/>
+        <w:t xml:space="preserve">├── draft/          plan · context · evidence</w:t>
+        <w:br/>
+        <w:t xml:space="preserve">└── delivery/web/     generated reading site</w:t>
+      </w:r>
+    </w:p>
+    <w:p>
       <w:r>
         <w:t xml:space="preserve">A Page Folder keeps everything needed to understand, change, and deliver one Page in one place. It can hold the Markdown source, code, figures, evidence, Runs and Results, and generated web, LaTeX, and Word files. Studio is where people brainstorm for the Page. Studio Chat keeps the conversation, while Studio Draw turns ideas into visual sketches. The Markdown source uses the same stem as the folder: haipipe-page-guide/ corresponds to haipipe-page-guide.md. Each delivery file is generated from that Markdown source instead of maintained as a separate source. The earlier HTML draft is kept only as material and does not control this Page or its outputs.</w:t>
       </w:r>
@@ -39,7 +55,7 @@
         <w:pStyle w:val="Heading1"/>
       </w:pPr>
       <w:r>
-        <w:t xml:space="preserve">2 · Board and plugins</w:t>
+        <w:t xml:space="preserve">2 · Board and workbenches</w:t>
       </w:r>
     </w:p>
     <w:p>
@@ -50,12 +66,38 @@
         <w:t xml:space="preserve">Division map</w:t>
       </w:r>
       <w:r>
-        <w:t xml:space="preserve">: Board navigation and plugin workspaces share the Page's sources.</w:t>
-      </w:r>
-    </w:p>
-    <w:p>
-      <w:r>
-        <w:t xml:space="preserve">Board supplies grouping, ordering, and navigation by registering the same Page Face. Removing that membership should leave the Page Folder and its content intact. Plugins present the Page's planning records, conversations, runs, outputs, and files through their own declared writers. A plugin is not enabled merely because a folder or a button bears its name; its surface must reach the real records and supported actions.</w:t>
+        <w:t xml:space="preserve">: Board navigation and workbench workspaces share the Page's sources.</w:t>
+      </w:r>
+    </w:p>
+    <w:p>
+      <w:pPr>
+        <w:pStyle w:val="Code"/>
+      </w:pPr>
+      <w:r>
+        <w:t xml:space="preserve">Board membership ──▶ Page Face</w:t>
+        <w:br/>
+        <w:t xml:space="preserve">                       │</w:t>
+        <w:br/>
+        <w:t xml:space="preserve">                 Page Folder</w:t>
+        <w:br/>
+        <w:t xml:space="preserve">                 ├── Outline   planning and evidence</w:t>
+        <w:br/>
+        <w:t xml:space="preserve">                 ├── Studio    chat and drawing</w:t>
+        <w:br/>
+        <w:t xml:space="preserve">                 ├── Runs</w:t>
+        <w:br/>
+        <w:t xml:space="preserve">                 │   ├── Page Run   rpNN · feedback · Versions · Steps</w:t>
+        <w:br/>
+        <w:t xml:space="preserve">                 │   └── Task Run   native id · delegated output</w:t>
+        <w:br/>
+        <w:t xml:space="preserve">                 ├── Delivery  generated outputs</w:t>
+        <w:br/>
+        <w:t xml:space="preserve">                 └── Folder    file inventory</w:t>
+      </w:r>
+    </w:p>
+    <w:p>
+      <w:r>
+        <w:t xml:space="preserve">Board supplies grouping, ordering, and navigation by registering the same Page Face. Removing that membership should leave the Page Folder and its content intact. Workbenches present the Page's planning records, conversations, runs, outputs, and files through their own declared writers. A workbench is not enabled merely because a folder or a button bears its name; its surface must reach the real records and supported actions.</w:t>
       </w:r>
     </w:p>
     <w:p>
@@ -70,7 +112,23 @@
     </w:p>
     <w:p>
       <w:r>
-        <w:t xml:space="preserve">The first Page Run is always rp00_mermaid-structure, where the person and agent iterate on the complete Mermaid argument map until the person explicitly closes it. That Mermaid Structure closure freezes the Page-global reading order as P01, P02, through PN, with every serial mapped to its plan address. After the Mermaid Structure closes, the Runs function creates Steps, each with a scope covering one or more of the N numbered paragraphs. Each selected paragraph Run uses a short identity that exposes the exact serial or contiguous range, such as rp01_p01 or rp02_p02-p03; its descriptive wording stays in Goal. Different human questions or acceptance boundaries call for different Step scopes, while code, Discovery, data, rendering, and build remain normal Task Runs.</w:t>
+        <w:t xml:space="preserve">The first Page Run is always rp-struct-01: one shared Structure Run in which the person and agent complete both SHAPE and SURVEY for the whole Page. The Structure Run's closure freezes the Page-global reading order as P01, P02, through PN, with every serial mapped to its plan address; multiple people may contribute Steps to this same Run. After rp-struct-01 closes, the Runs function creates paragraph Runs, each with a scope covering one or more of the N numbered paragraphs. Each selected paragraph Run uses a typed identity that exposes the exact serial or contiguous range, such as rp-para-01_P01 or rp-para-02_P02-P03; its descriptive wording stays in Goal. Different human questions or acceptance boundaries call for different Step scopes, while code, Discovery, data, rendering, and build remain normal Task Runs.</w:t>
+      </w:r>
+    </w:p>
+    <w:p>
+      <w:pPr>
+        <w:pStyle w:val="Code"/>
+      </w:pPr>
+      <w:r>
+        <w:t xml:space="preserve">flowchart LR</w:t>
+        <w:br/>
+        <w:t xml:space="preserve">  O["rp-struct-01"] --&gt;|human closes SHAPE + SURVEY + P01..PN| I["numbered paragraph index"]</w:t>
+        <w:br/>
+        <w:t xml:space="preserve">  I --&gt; R1["rp-para-01_P01"]</w:t>
+        <w:br/>
+        <w:t xml:space="preserve">  I --&gt; R2["rp-para-02_P02-P03"]</w:t>
+        <w:br/>
+        <w:t xml:space="preserve">  I --&gt; RN["rp-para-NN_PNN"]</w:t>
       </w:r>
     </w:p>
     <w:p>
@@ -90,6 +148,30 @@
       </w:r>
       <w:r>
         <w:t xml:space="preserve">: feedback changes a bounded source before delivery is refreshed.</w:t>
+      </w:r>
+    </w:p>
+    <w:p>
+      <w:pPr>
+        <w:pStyle w:val="Code"/>
+      </w:pPr>
+      <w:r>
+        <w:t xml:space="preserve">Your request</w:t>
+        <w:br/>
+        <w:t xml:space="preserve">    ↓</w:t>
+        <w:br/>
+        <w:t xml:space="preserve">Context and current plan</w:t>
+        <w:br/>
+        <w:t xml:space="preserve">    ↓</w:t>
+        <w:br/>
+        <w:t xml:space="preserve">Candidate change + feedback record</w:t>
+        <w:br/>
+        <w:t xml:space="preserve">    ↓</w:t>
+        <w:br/>
+        <w:t xml:space="preserve">Explicit scoped acceptance</w:t>
+        <w:br/>
+        <w:t xml:space="preserve">    ↓</w:t>
+        <w:br/>
+        <w:t xml:space="preserve">Adopted Content → refreshed delivery</w:t>
       </w:r>
     </w:p>
     <w:p>
@@ -232,6 +314,18 @@
       <w:sz w:val="20"/>
     </w:rPr>
   </w:style>
+  <w:style w:type="paragraph" w:styleId="Code">
+    <w:name w:val="Code"/>
+    <w:basedOn w:val="Normal"/>
+    <w:pPr>
+      <w:spacing w:before="120" w:after="120" w:line="240" w:lineRule="auto"/>
+      <w:shd w:val="clear" w:color="auto" w:fill="F4F4F5"/>
+    </w:pPr>
+    <w:rPr>
+      <w:rFonts w:ascii="Courier New" w:hAnsi="Courier New"/>
+      <w:sz w:val="20"/>
+    </w:rPr>
+  </w:style>
   <w:style w:type="table" w:styleId="TableGrid">
     <w:name w:val="Table Grid"/>
   </w:style>

</xml_diff>